<commit_message>
docs(nawa): make limited-access note client-sendable under Nawa brand
Remove Agentium, transitivity and vendor-internal wording so the Word
can go to the client as a Nawa product note.

Co-authored-by: thibaud.ishacian <thibaud.ishacian@gmail.com>
</commit_message>
<xml_diff>
--- a/docs/ops/nawa-limited-access-release-7-october-2026.docx
+++ b/docs/ops/nawa-limited-access-release-7-october-2026.docx
@@ -43,7 +43,7 @@
           <w:color w:val="000000"/>
           <w:sz w:val="22"/>
         </w:rPr>
-        <w:t>Nawa is the white-label of Agentium. From 7 October 2026 it will be available for a limited client assessment in a controlled, versioned environment. The assessment is for the intended end users — data scientists and AI engineers — so they can operate the product unattended across the declared functional envelope. Nawa does not receive a parallel feature set. Every Agentium capability included in the release is inherited by Nawa by transitivity, under the same contracts. This protects production systems, proprietary assets and unrelated environments, and it gives both parties a stable and reproducible basis for review.</w:t>
+        <w:t>Nawa will be available for a limited client assessment from 7 October 2026. The review will use a controlled, versioned environment so that the intended end users — data scientists and AI engineers — can operate Nawa unattended across the declared functional envelope. This approach gives both parties a stable and reproducible basis for technical review while protecting production systems, proprietary assets and unrelated environments.</w:t>
       </w:r>
     </w:p>
     <w:p>
@@ -73,7 +73,7 @@
           <w:color w:val="000000"/>
           <w:sz w:val="21"/>
         </w:rPr>
-        <w:t>The objective is not a single representative agent and not a guided replay of one System. The 7 October baseline is reached when a data scientist or AI engineer can use Nawa in complete autonomy across the Agentium functional scope included in the release: Work, Create / Studio, Systems, Flows, Runs, Decisions, Data &amp; Models, evaluation, identity and audit.</w:t>
+        <w:t>The objective is not a single representative agent and not a guided replay of one System. The 7 October baseline is reached when a data scientist or AI engineer can use Nawa in complete autonomy across the functional scope included in the release: Work, Create / Studio, Systems, Flows, Runs, Decisions, Data &amp; Models, evaluation, identity and audit.</w:t>
       </w:r>
     </w:p>
     <w:p>
@@ -87,7 +87,7 @@
           <w:color w:val="000000"/>
           <w:sz w:val="21"/>
         </w:rPr>
-        <w:t>The release brings those existing product families into one consistent configuration. It does not expand the agreed functional scope. It does not open Marketplace listing, cluster portability or factory-scale rollout.</w:t>
+        <w:t>The release brings those existing Nawa capabilities into one consistent configuration. It does not expand the agreed functional scope. It does not open Marketplace listing, cluster portability or factory-scale rollout.</w:t>
       </w:r>
     </w:p>
     <w:p>
@@ -253,7 +253,7 @@
                 <w:color w:val="000000"/>
                 <w:sz w:val="18"/>
               </w:rPr>
-              <w:t>Agentium is still aligning the families that Nawa will inherit. Observations made now may not correspond to the released configuration.</w:t>
+              <w:t>Nawa remains within its normal consolidation cycle. Observations made against the current environment may not correspond to the released configuration.</w:t>
             </w:r>
           </w:p>
         </w:tc>
@@ -324,7 +324,7 @@
                 <w:color w:val="000000"/>
                 <w:sz w:val="18"/>
               </w:rPr>
-              <w:t>End users would still need a guided session. Findings would describe a presenter-led path, not unattended use of the envelope.</w:t>
+              <w:t>End users would still need a guided session. Findings would describe a presenter-led path, not unattended use of the product.</w:t>
             </w:r>
           </w:p>
         </w:tc>
@@ -361,7 +361,7 @@
                 <w:color w:val="000000"/>
                 <w:sz w:val="18"/>
               </w:rPr>
-              <w:t>Incomplete inheritance</w:t>
+              <w:t>Incomplete product consistency</w:t>
             </w:r>
           </w:p>
         </w:tc>
@@ -393,7 +393,7 @@
                 <w:color w:val="000000"/>
                 <w:sz w:val="18"/>
               </w:rPr>
-              <w:t>A capability that is not yet consistently enforced on Agentium is not yet a Nawa capability, even if a seeded example exists.</w:t>
+              <w:t>A capability that is not yet consistently available across Nawa is not yet part of the assessment baseline, even if a single example exists.</w:t>
             </w:r>
           </w:p>
         </w:tc>
@@ -572,7 +572,7 @@
           <w:color w:val="000000"/>
           <w:sz w:val="30"/>
         </w:rPr>
-        <w:t>Product roadmap — Agentium capabilities inherited by Nawa</w:t>
+        <w:t>Nawa product roadmap</w:t>
       </w:r>
     </w:p>
     <w:p>
@@ -587,7 +587,7 @@
           <w:color w:val="000000"/>
           <w:sz w:val="21"/>
         </w:rPr>
-        <w:t>The roadmap below is the Agentium product plan for 16 September–7 October 2026. Each row is a generic platform capability. Nawa receives it by transitivity when that capability is in the controlled release. It is not a Nawa-only build and it is not scoped to one System.</w:t>
+        <w:t>The roadmap below is the Nawa product plan for 16 September–7 October 2026. Each row is a platform capability. It is not scoped to one System.</w:t>
       </w:r>
     </w:p>
     <w:tbl>
@@ -635,7 +635,7 @@
                 <w:color w:val="FFFFFF"/>
                 <w:sz w:val="18"/>
               </w:rPr>
-              <w:t>Agentium capability</w:t>
+              <w:t>Nawa capability</w:t>
             </w:r>
           </w:p>
         </w:tc>
@@ -668,7 +668,7 @@
                 <w:color w:val="FFFFFF"/>
                 <w:sz w:val="18"/>
               </w:rPr>
-              <w:t>Inherited Nawa outcome</w:t>
+              <w:t>What the release makes operable</w:t>
             </w:r>
           </w:p>
         </w:tc>
@@ -737,7 +737,7 @@
                 <w:color w:val="000000"/>
                 <w:sz w:val="18"/>
               </w:rPr>
-              <w:t>Published Experiences are launched from Work. The operator does not need a presenter URL.</w:t>
+              <w:t>Published applications are launched from Work. The operator does not need a prepared bookmark.</w:t>
             </w:r>
           </w:p>
         </w:tc>
@@ -877,7 +877,7 @@
                 <w:color w:val="000000"/>
                 <w:sz w:val="18"/>
               </w:rPr>
-              <w:t>The published Flow is the executable contract. Drafts are not selectable; versions do not float in silence.</w:t>
+              <w:t>The published Flow is the executable contract. Drafts are not selectable; versions do not change in silence.</w:t>
             </w:r>
           </w:p>
         </w:tc>
@@ -1157,7 +1157,7 @@
                 <w:color w:val="000000"/>
                 <w:sz w:val="18"/>
               </w:rPr>
-              <w:t>Routing and fallback are workspace policy, applied to every in-envelope System.</w:t>
+              <w:t>Routing and fallback are workspace policy, applied to every System in the release.</w:t>
             </w:r>
           </w:p>
         </w:tc>
@@ -1228,7 +1228,7 @@
                 <w:color w:val="000000"/>
                 <w:sz w:val="18"/>
               </w:rPr>
-              <w:t>Dataset → model version → evaluation → published Skill is a product loop, not a seeded demo only.</w:t>
+              <w:t>Dataset → model version → evaluation → published Skill is a product loop, not a seeded example only.</w:t>
             </w:r>
           </w:p>
         </w:tc>
@@ -1368,7 +1368,7 @@
                 <w:color w:val="000000"/>
                 <w:sz w:val="18"/>
               </w:rPr>
-              <w:t>Identity, permitted actions and the approval path are the same contracts on every inherited System.</w:t>
+              <w:t>Identity, permitted actions and the approval path are the same contracts on every System in the release.</w:t>
             </w:r>
           </w:p>
         </w:tc>
@@ -1437,7 +1437,7 @@
                 <w:color w:val="000000"/>
                 <w:sz w:val="18"/>
               </w:rPr>
-              <w:t>Execution events, traces and operating signals belong to the Run ledger.</w:t>
+              <w:t>Execution events, traces and operating signals belong to the Run record.</w:t>
             </w:r>
           </w:p>
         </w:tc>
@@ -1475,7 +1475,7 @@
                 <w:color w:val="000000"/>
                 <w:sz w:val="18"/>
               </w:rPr>
-              <w:t>Impact / Hypervisor</w:t>
+              <w:t>Impact</w:t>
             </w:r>
           </w:p>
         </w:tc>
@@ -1577,7 +1577,7 @@
                 <w:color w:val="000000"/>
                 <w:sz w:val="18"/>
               </w:rPr>
-              <w:t>The handover pack matches the versioned Compose configuration of the release. Kubernetes / Marketplace packaging is outside this envelope.</w:t>
+              <w:t>The handover pack matches the versioned configuration of the release. Marketplace and cluster packaging are outside this envelope.</w:t>
             </w:r>
           </w:p>
         </w:tc>
@@ -1600,7 +1600,7 @@
           <w:color w:val="17365D"/>
           <w:sz w:val="21"/>
         </w:rPr>
-        <w:t>Release principle: one Agentium product envelope, inherited by Nawa, operable without a guided session.</w:t>
+        <w:t>Release principle: one Nawa product envelope, operable without a guided session.</w:t>
       </w:r>
     </w:p>
     <w:p>
@@ -1631,7 +1631,7 @@
           <w:color w:val="000000"/>
           <w:sz w:val="21"/>
         </w:rPr>
-        <w:t>The following activities consolidate, standardise and consistently enforce existing Agentium capabilities so that Nawa can inherit them. They do not introduce additional functional scope.</w:t>
+        <w:t>The following activities consolidate, standardise and consistently enforce existing Nawa capabilities. They do not introduce additional functional scope.</w:t>
       </w:r>
     </w:p>
     <w:tbl>
@@ -1712,7 +1712,7 @@
                 <w:color w:val="FFFFFF"/>
                 <w:sz w:val="18"/>
               </w:rPr>
-              <w:t>Agentium product work (inherited by Nawa)</w:t>
+              <w:t>Nawa product work</w:t>
             </w:r>
           </w:p>
         </w:tc>
@@ -1781,7 +1781,7 @@
                 <w:color w:val="000000"/>
                 <w:sz w:val="18"/>
               </w:rPr>
-              <w:t>Freeze the 7 October capability map. Apply the honesty contract (measured / declared / missing / sealed) across Work, Create, Systems, Runs, Decisions and Impact. Align lexicon and navigation so the same families are discoverable without a presenter.</w:t>
+              <w:t>Freeze the 7 October capability map. Apply the honesty contract (measured / declared / missing / sealed) across Work, Create, Systems, Runs, Decisions and Impact. Align navigation so the same families are discoverable without a guided session.</w:t>
             </w:r>
           </w:p>
         </w:tc>
@@ -1852,7 +1852,7 @@
                 <w:color w:val="000000"/>
                 <w:sz w:val="18"/>
               </w:rPr>
-              <w:t>Make the generic operate loop autonomous: launch an Experience, execute its System, open the Run evidence from the Work result, record a Decision. Align evaluation evidence with that Run. Any in-envelope System must follow this loop, not only a hero path.</w:t>
+              <w:t>Make the operate loop autonomous: launch an application, execute its System, open the Run evidence from the Work result, record a Decision. Align evaluation evidence with that Run. Any System in the release must follow this loop, not only a single prepared example.</w:t>
             </w:r>
           </w:p>
         </w:tc>
@@ -1921,7 +1921,7 @@
                 <w:color w:val="000000"/>
                 <w:sz w:val="18"/>
               </w:rPr>
-              <w:t>Make the generic build loop autonomous: bind a published System in Studio, pass ready-check, cut an immutable Release, deploy Pilot or In-service. Make the data loop autonomous: dataset, model version, evaluation, published Skill, model-routing policy.</w:t>
+              <w:t>Make the build loop autonomous: bind a published System in Studio, pass ready-check, cut an immutable Release, deploy Pilot or In-service. Make the data loop autonomous: dataset, model version, evaluation, published Skill, model-routing policy.</w:t>
             </w:r>
           </w:p>
         </w:tc>
@@ -1992,7 +1992,7 @@
                 <w:color w:val="000000"/>
                 <w:sz w:val="18"/>
               </w:rPr>
-              <w:t>Unattended dry-run of the declared envelope by data-scientist / AI-engineer profiles. Open limited access only for the families that passed. A family that still requires Datategy is labelled as such or left out of the envelope.</w:t>
+              <w:t>Unattended dry-run of the declared envelope by data-scientist / AI-engineer profiles. Open limited access only for the families that passed. A family that still requires a guided session is labelled as such or left out of the envelope.</w:t>
             </w:r>
           </w:p>
         </w:tc>
@@ -2032,7 +2032,7 @@
           <w:color w:val="000000"/>
           <w:sz w:val="21"/>
         </w:rPr>
-        <w:t>The following activities concern consolidation, standardisation and consistent enforcement of existing Agentium capabilities. They are part of establishing the controlled release baseline and do not introduce additional functional scope. Nawa inherits the result by transitivity.</w:t>
+        <w:t>The following activities concern consolidation, standardisation and consistent enforcement of existing Nawa capabilities. They are part of establishing the controlled release baseline and do not introduce additional functional scope.</w:t>
       </w:r>
     </w:p>
     <w:tbl>
@@ -2150,7 +2150,7 @@
                 <w:color w:val="000000"/>
                 <w:sz w:val="18"/>
               </w:rPr>
-              <w:t>Work and Experience runtime</w:t>
+              <w:t>Work and application runtime</w:t>
             </w:r>
           </w:p>
         </w:tc>
@@ -2182,7 +2182,7 @@
                 <w:color w:val="000000"/>
                 <w:sz w:val="18"/>
               </w:rPr>
-              <w:t>Consolidate the launcher, certified renderer pin and deployment records so published Experiences are operable from Work.</w:t>
+              <w:t>Consolidate the launcher and deployment records so published applications are operable from Work.</w:t>
             </w:r>
           </w:p>
         </w:tc>
@@ -2533,7 +2533,7 @@
                 <w:color w:val="000000"/>
                 <w:sz w:val="18"/>
               </w:rPr>
-              <w:t>Apply the supported routing and fallback policies as workspace policy, not per demo.</w:t>
+              <w:t>Apply the supported routing and fallback policies as workspace policy, not per example.</w:t>
             </w:r>
           </w:p>
         </w:tc>
@@ -2813,7 +2813,7 @@
                 <w:color w:val="000000"/>
                 <w:sz w:val="18"/>
               </w:rPr>
-              <w:t>Consolidate execution events, traces and operating signals for the inherited Systems.</w:t>
+              <w:t>Consolidate execution events, traces and operating signals for the Systems in the release.</w:t>
             </w:r>
           </w:p>
         </w:tc>
@@ -2993,7 +2993,7 @@
           <w:color w:val="000000"/>
           <w:sz w:val="21"/>
         </w:rPr>
-        <w:t>The session is designed so that a data scientist or AI engineer can operate the inherited Agentium families together, rather than watching multiple disconnected demonstrations. The walkthrough is not limited to one System.</w:t>
+        <w:t>The session is designed so that a data scientist or AI engineer can operate the Nawa capabilities together, rather than watching multiple disconnected demonstrations. The walkthrough is not limited to one System.</w:t>
       </w:r>
     </w:p>
     <w:tbl>
@@ -3143,7 +3143,7 @@
                 <w:color w:val="000000"/>
                 <w:sz w:val="18"/>
               </w:rPr>
-              <w:t>Launch of a published Experience chosen by the operator, not only a presenter bookmark.</w:t>
+              <w:t>Launch of a published application chosen by the operator, not only a prepared bookmark.</w:t>
             </w:r>
           </w:p>
         </w:tc>
@@ -4094,7 +4094,7 @@
           <w:color w:val="000000"/>
           <w:sz w:val="21"/>
         </w:rPr>
-        <w:t>These items remain Agentium product work. They are not inherited by Nawa in this limited access release.</w:t>
+        <w:t>These items remain later Nawa product work. They are not part of this limited access release.</w:t>
       </w:r>
     </w:p>
     <w:tbl>
@@ -4282,7 +4282,7 @@
                 <w:color w:val="000000"/>
                 <w:sz w:val="18"/>
               </w:rPr>
-              <w:t>Kubernetes / Helm portability</w:t>
+              <w:t>Cluster portability</w:t>
             </w:r>
           </w:p>
         </w:tc>
@@ -4315,7 +4315,7 @@
                 <w:color w:val="000000"/>
                 <w:sz w:val="18"/>
               </w:rPr>
-              <w:t>The reference environment is the versioned Compose configuration. Cluster packaging is a later product increment.</w:t>
+              <w:t>The reference environment is the versioned configuration of this release. Cluster packaging is a later product increment.</w:t>
             </w:r>
           </w:p>
         </w:tc>
@@ -4422,7 +4422,7 @@
                 <w:color w:val="000000"/>
                 <w:sz w:val="18"/>
               </w:rPr>
-              <w:t>Hypervisor as attested financial ROI</w:t>
+              <w:t>Impact as attested financial return</w:t>
             </w:r>
           </w:p>
         </w:tc>
@@ -4524,7 +4524,7 @@
                 <w:color w:val="000000"/>
                 <w:sz w:val="18"/>
               </w:rPr>
-              <w:t>The 7 October end users are data scientists and AI engineers. Business-user adoption chrome is a separate acceptance.</w:t>
+              <w:t>The 7 October end users are data scientists and AI engineers. Business-user onboarding is a separate acceptance.</w:t>
             </w:r>
           </w:p>
         </w:tc>
@@ -4635,7 +4635,7 @@
           <w:color w:val="000000"/>
           <w:sz w:val="20"/>
         </w:rPr>
-        <w:t>The declared Agentium envelope on the Nawa workspace, in an isolated assessment environment.</w:t>
+        <w:t>The declared Nawa product envelope, in an isolated assessment environment.</w:t>
       </w:r>
     </w:p>
     <w:p>

</xml_diff>